<commit_message>
Stop the page jumping while the hero line types; update the resume
On phones the typed subtitle wrapped onto more lines as it typed, pushing
everything below down 49px a few seconds after load, which felt like being
pulled back mid-scroll. An invisible copy of the full line now reserves its
space. The section-link jump also stops for good once the visitor scrolls.

Co-Authored-By: Claude Opus 5.5 <noreply@anthropic.com>
</commit_message>
<xml_diff>
--- a/General-Resume_Aim.docx
+++ b/General-Resume_Aim.docx
@@ -327,7 +327,7 @@
           <w:i/>
           <w:sz w:val="17"/>
         </w:rPr>
-        <w:t>Self-Directed, 2016 to Present</w:t>
+        <w:t>Self-Directed, 2023 to Present</w:t>
       </w:r>
     </w:p>
     <w:p>
@@ -338,6 +338,74 @@
       </w:pPr>
       <w:r>
         <w:t>Build, upgrade, diagnose, and maintain systems supporting Linux, Docker, Unraid, ZFS storage, backups, monitoring, DNS, and self-hosted services. Recovered a Docker storage migration by rebuilding 13 containers and restoring service configuration. Publish selected hardware writeups at https://teardown.cafe.</w:t>
+      </w:r>
+    </w:p>
+    <w:p>
+      <w:pPr>
+        <w:spacing w:before="60" w:after="0"/>
+      </w:pPr>
+      <w:r>
+        <w:rPr>
+          <w:b/>
+          <w:sz w:val="19"/>
+        </w:rPr>
+        <w:t>Penthouse Hotswap Failover Node</w:t>
+      </w:r>
+    </w:p>
+    <w:p>
+      <w:pPr>
+        <w:spacing w:after="20"/>
+      </w:pPr>
+      <w:r>
+        <w:rPr>
+          <w:i/>
+          <w:sz w:val="17"/>
+        </w:rPr>
+        <w:t>Self-Directed, 2026 to Present</w:t>
+      </w:r>
+    </w:p>
+    <w:p>
+      <w:pPr>
+        <w:pStyle w:val="ListBullet"/>
+        <w:spacing w:after="30" w:line="240" w:lineRule="auto"/>
+        <w:ind w:left="288" w:hanging="187"/>
+      </w:pPr>
+      <w:r>
+        <w:t>Designed and fault-tested a read-only failover architecture using PostgreSQL synchronous replication, HAProxy reader routing, and media mirroring across a primary Unraid server and a mini-PC standby node, with a single-writer model preventing split-brain writes.</w:t>
+      </w:r>
+    </w:p>
+    <w:p>
+      <w:pPr>
+        <w:spacing w:before="60" w:after="0"/>
+      </w:pPr>
+      <w:r>
+        <w:rPr>
+          <w:b/>
+          <w:sz w:val="19"/>
+        </w:rPr>
+        <w:t>Local LLM Inference Server (BigRig)</w:t>
+      </w:r>
+    </w:p>
+    <w:p>
+      <w:pPr>
+        <w:spacing w:after="20"/>
+      </w:pPr>
+      <w:r>
+        <w:rPr>
+          <w:i/>
+          <w:sz w:val="17"/>
+        </w:rPr>
+        <w:t>Self-Directed, 2026 to Present</w:t>
+      </w:r>
+    </w:p>
+    <w:p>
+      <w:pPr>
+        <w:pStyle w:val="ListBullet"/>
+        <w:spacing w:after="30" w:line="240" w:lineRule="auto"/>
+        <w:ind w:left="288" w:hanging="187"/>
+      </w:pPr>
+      <w:r>
+        <w:t>Built a multi-GPU inference server (Ryzen 9 7950X, 64GB DDR5, RX 9060 XT 16GB, dual RTX 3060) serving language models over an OpenAI-compatible API to LAN clients, with benchmark-driven model and quantization selection.</w:t>
       </w:r>
     </w:p>
     <w:p>
@@ -528,6 +596,14 @@
       </w:pPr>
       <w:r>
         <w:t>In progress, expected May 2028</w:t>
+      </w:r>
+    </w:p>
+    <w:p>
+      <w:pPr>
+        <w:spacing w:after="30" w:line="240" w:lineRule="auto"/>
+      </w:pPr>
+      <w:r>
+        <w:t>High School Diploma, Virginia Virtual Academy, Staunton, VA, May 2022</w:t>
       </w:r>
     </w:p>
     <w:sectPr>

</xml_diff>